<commit_message>
Update guides for consent, privacy notice and the Account page
Co-Authored-By: Claude Sonnet 5.5 <noreply@anthropic.com>
</commit_message>
<xml_diff>
--- a/docs/LPU-App-Facilitator-Guide.docx
+++ b/docs/LPU-App-Facilitator-Guide.docx
@@ -124,7 +124,7 @@
             <w:pPr>
               <w:spacing w:after="40"/>
             </w:pPr>
-            <w:hyperlink w:history="1" r:id="rIdw6kzvci-trzrlgo0okqwg">
+            <w:hyperlink w:history="1" r:id="rId19ccxci98dpglfwuhhduo">
               <w:r>
                 <w:rPr>
                   <w:rFonts w:ascii="Calibri" w:cs="Calibri" w:eastAsia="Calibri" w:hAnsi="Calibri"/>
@@ -274,7 +274,7 @@
                 <w:sz w:val="20"/>
                 <w:szCs w:val="20"/>
               </w:rPr>
-              <w:t xml:space="preserve">Supabase project “MY BUSINESS HEALTH CALCULATOR” (see the warning in Section 1)</w:t>
+              <w:t xml:space="preserve">Supabase project â€œMY BUSINESS HEALTH CALCULATORâ€ (see the warning in Section 1)</w:t>
             </w:r>
           </w:p>
         </w:tc>
@@ -702,7 +702,7 @@
                 <w:sz w:val="20"/>
                 <w:szCs w:val="20"/>
               </w:rPr>
-              <w:t xml:space="preserve">Supabase → Authentication → Users</w:t>
+              <w:t xml:space="preserve">Supabase â†’ Authentication â†’ Users</w:t>
             </w:r>
           </w:p>
         </w:tc>
@@ -1033,7 +1033,7 @@
                 <w:sz w:val="20"/>
                 <w:szCs w:val="20"/>
               </w:rPr>
-              <w:t xml:space="preserve">Processed by Anthropic. Check this against your institution’s data policy.</w:t>
+              <w:t xml:space="preserve">Processed by Anthropic. Check this against your institutionâ€™s data policy.</w:t>
             </w:r>
           </w:p>
         </w:tc>
@@ -1108,7 +1108,7 @@
                 <w:sz w:val="21"/>
                 <w:szCs w:val="21"/>
               </w:rPr>
-              <w:t xml:space="preserve">The Supabase project that holds this app’s data also holds your </w:t>
+              <w:t xml:space="preserve">The Supabase project that holds this appâ€™s data also holds your </w:t>
             </w:r>
             <w:r>
               <w:rPr>
@@ -1128,7 +1128,7 @@
                 <w:sz w:val="21"/>
                 <w:szCs w:val="21"/>
               </w:rPr>
-              <w:t xml:space="preserve"> app. The two are kept apart by table names (this app’s tables all start with lpu_), but the </w:t>
+              <w:t xml:space="preserve"> app. The two are kept apart by table names (this appâ€™s tables all start with lpu_), but the </w:t>
             </w:r>
             <w:r>
               <w:rPr>
@@ -1173,7 +1173,7 @@
                 <w:sz w:val="21"/>
                 <w:szCs w:val="21"/>
               </w:rPr>
-              <w:t xml:space="preserve">Never export or edit the whole Users list, and never delete a user from Authentication → Users</w:t>
+              <w:t xml:space="preserve">Never export or edit the whole Users list, and never delete a user from Authentication â†’ Users</w:t>
             </w:r>
             <w:r>
               <w:rPr>
@@ -1182,7 +1182,7 @@
                 <w:sz w:val="21"/>
                 <w:szCs w:val="21"/>
               </w:rPr>
-              <w:t xml:space="preserve">, because that would also remove them from the other app. To remove a participant’s data, use the queries in Section 8.</w:t>
+              <w:t xml:space="preserve">, because that would also remove them from the other app. To remove a participantâ€™s data, use the queries in Section 8.</w:t>
             </w:r>
           </w:p>
         </w:tc>
@@ -1366,7 +1366,7 @@
                 <w:sz w:val="20"/>
                 <w:szCs w:val="20"/>
               </w:rPr>
-              <w:t xml:space="preserve">☐</w:t>
+              <w:t xml:space="preserve">â˜</w:t>
             </w:r>
           </w:p>
         </w:tc>
@@ -1428,7 +1428,7 @@
                 <w:sz w:val="20"/>
                 <w:szCs w:val="20"/>
               </w:rPr>
-              <w:t xml:space="preserve">Open console.anthropic.com → Billing. Make sure there is credit. Every generation and every stress test is a paid request.</w:t>
+              <w:t xml:space="preserve">Open console.anthropic.com â†’ Billing. Make sure there is credit. Every generation and every stress test is a paid request.</w:t>
             </w:r>
           </w:p>
         </w:tc>
@@ -1465,7 +1465,7 @@
                 <w:sz w:val="20"/>
                 <w:szCs w:val="20"/>
               </w:rPr>
-              <w:t xml:space="preserve">☐</w:t>
+              <w:t xml:space="preserve">â˜</w:t>
             </w:r>
           </w:p>
         </w:tc>
@@ -1529,7 +1529,7 @@
                 <w:sz w:val="20"/>
                 <w:szCs w:val="20"/>
               </w:rPr>
-              <w:t xml:space="preserve">Do one full run yourself (generate plus stress test). Then open console.anthropic.com → Usage and note the cost. Multiply by the number of participants and by how many runs you expect each. Add some spare.</w:t>
+              <w:t xml:space="preserve">Do one full run yourself (generate plus stress test). Then open console.anthropic.com â†’ Usage and note the cost. Multiply by the number of participants and by how many runs you expect each. Add some spare.</w:t>
             </w:r>
           </w:p>
         </w:tc>
@@ -1565,7 +1565,7 @@
                 <w:sz w:val="20"/>
                 <w:szCs w:val="20"/>
               </w:rPr>
-              <w:t xml:space="preserve">☐</w:t>
+              <w:t xml:space="preserve">â˜</w:t>
             </w:r>
           </w:p>
         </w:tc>
@@ -1664,7 +1664,7 @@
                 <w:sz w:val="20"/>
                 <w:szCs w:val="20"/>
               </w:rPr>
-              <w:t xml:space="preserve">☐</w:t>
+              <w:t xml:space="preserve">â˜</w:t>
             </w:r>
           </w:p>
         </w:tc>
@@ -1764,7 +1764,7 @@
                 <w:sz w:val="20"/>
                 <w:szCs w:val="20"/>
               </w:rPr>
-              <w:t xml:space="preserve">☐</w:t>
+              <w:t xml:space="preserve">â˜</w:t>
             </w:r>
           </w:p>
         </w:tc>
@@ -1826,7 +1826,7 @@
                 <w:sz w:val="20"/>
                 <w:szCs w:val="20"/>
               </w:rPr>
-              <w:t xml:space="preserve">Default is 15 generations and 10 stress tests per person per 24 hours. To change them: Vercel → lpu-assignment-app → Settings → Environment Variables → add DAILY_GENERATION_LIMIT and DAILY_STRESS_TEST_LIMIT, then redeploy.</w:t>
+              <w:t xml:space="preserve">Default is 15 generations and 10 stress tests per person per 24 hours. To change them: Vercel â†’ lpu-assignment-app â†’ Settings â†’ Environment Variables â†’ add DAILY_GENERATION_LIMIT and DAILY_STRESS_TEST_LIMIT, then redeploy.</w:t>
             </w:r>
           </w:p>
         </w:tc>
@@ -1863,7 +1863,7 @@
                 <w:sz w:val="20"/>
                 <w:szCs w:val="20"/>
               </w:rPr>
-              <w:t xml:space="preserve">☐</w:t>
+              <w:t xml:space="preserve">â˜</w:t>
             </w:r>
           </w:p>
         </w:tc>
@@ -1983,7 +1983,7 @@
                 <w:sz w:val="20"/>
                 <w:szCs w:val="20"/>
               </w:rPr>
-              <w:t xml:space="preserve">☐</w:t>
+              <w:t xml:space="preserve">â˜</w:t>
             </w:r>
           </w:p>
         </w:tc>
@@ -2102,7 +2102,7 @@
                 <w:sz w:val="20"/>
                 <w:szCs w:val="20"/>
               </w:rPr>
-              <w:t xml:space="preserve">☐</w:t>
+              <w:t xml:space="preserve">â˜</w:t>
             </w:r>
           </w:p>
         </w:tc>
@@ -2202,7 +2202,7 @@
                 <w:sz w:val="20"/>
                 <w:szCs w:val="20"/>
               </w:rPr>
-              <w:t xml:space="preserve">☐</w:t>
+              <w:t xml:space="preserve">â˜</w:t>
             </w:r>
           </w:p>
         </w:tc>
@@ -2301,7 +2301,7 @@
                 <w:sz w:val="20"/>
                 <w:szCs w:val="20"/>
               </w:rPr>
-              <w:t xml:space="preserve">☐</w:t>
+              <w:t xml:space="preserve">â˜</w:t>
             </w:r>
           </w:p>
         </w:tc>
@@ -2459,7 +2459,7 @@
                 <w:sz w:val="21"/>
                 <w:szCs w:val="21"/>
               </w:rPr>
-              <w:t xml:space="preserve">The confirmation emails are sent by Supabase’s built-in email service, which allows only a small number of emails per hour. If 30 people sign up in the same minute, many will not receive theirs.</w:t>
+              <w:t xml:space="preserve">The confirmation emails are sent by Supabaseâ€™s built-in email service, which allows only a small number of emails per hour. If 30 people sign up in the same minute, many will not receive theirs.</w:t>
             </w:r>
           </w:p>
           <w:p>
@@ -2484,7 +2484,7 @@
                 <w:sz w:val="21"/>
                 <w:szCs w:val="21"/>
               </w:rPr>
-              <w:t xml:space="preserve"> (1) ask participants to sign up on different days before the session, or (2) ask the person who looks after the app to connect a proper email sender in Supabase (Authentication → Emails → SMTP Settings; menu names may differ slightly). You can see the current limit under Authentication → Rate Limits.</w:t>
+              <w:t xml:space="preserve"> (1) ask participants to sign up on different days before the session, or (2) ask the person who looks after the app to connect a proper email sender in Supabase (Authentication â†’ Emails â†’ SMTP Settings; menu names may differ slightly). You can see the current limit under Authentication â†’ Rate Limits.</w:t>
             </w:r>
           </w:p>
           <w:p>
@@ -2697,7 +2697,7 @@
                 <w:sz w:val="20"/>
                 <w:szCs w:val="20"/>
               </w:rPr>
-              <w:t xml:space="preserve">0–10</w:t>
+              <w:t xml:space="preserve">0â€“10</w:t>
             </w:r>
           </w:p>
         </w:tc>
@@ -2796,7 +2796,7 @@
                 <w:sz w:val="20"/>
                 <w:szCs w:val="20"/>
               </w:rPr>
-              <w:t xml:space="preserve">10–15</w:t>
+              <w:t xml:space="preserve">10â€“15</w:t>
             </w:r>
           </w:p>
         </w:tc>
@@ -2896,7 +2896,7 @@
                 <w:sz w:val="20"/>
                 <w:szCs w:val="20"/>
               </w:rPr>
-              <w:t xml:space="preserve">15–20</w:t>
+              <w:t xml:space="preserve">15â€“20</w:t>
             </w:r>
           </w:p>
         </w:tc>
@@ -2995,7 +2995,7 @@
                 <w:sz w:val="20"/>
                 <w:szCs w:val="20"/>
               </w:rPr>
-              <w:t xml:space="preserve">20–40</w:t>
+              <w:t xml:space="preserve">20â€“40</w:t>
             </w:r>
           </w:p>
         </w:tc>
@@ -3095,7 +3095,7 @@
                 <w:sz w:val="20"/>
                 <w:szCs w:val="20"/>
               </w:rPr>
-              <w:t xml:space="preserve">40–50</w:t>
+              <w:t xml:space="preserve">40â€“50</w:t>
             </w:r>
           </w:p>
         </w:tc>
@@ -3126,7 +3126,7 @@
                 <w:sz w:val="20"/>
                 <w:szCs w:val="20"/>
               </w:rPr>
-              <w:t xml:space="preserve">Pairs review each other’s result with the checklist (Step 4 of the guide).</w:t>
+              <w:t xml:space="preserve">Pairs review each otherâ€™s result with the checklist (Step 4 of the guide).</w:t>
             </w:r>
           </w:p>
         </w:tc>
@@ -3194,7 +3194,7 @@
                 <w:sz w:val="20"/>
                 <w:szCs w:val="20"/>
               </w:rPr>
-              <w:t xml:space="preserve">50–70</w:t>
+              <w:t xml:space="preserve">50â€“70</w:t>
             </w:r>
           </w:p>
         </w:tc>
@@ -3294,7 +3294,7 @@
                 <w:sz w:val="20"/>
                 <w:szCs w:val="20"/>
               </w:rPr>
-              <w:t xml:space="preserve">70–85</w:t>
+              <w:t xml:space="preserve">70â€“85</w:t>
             </w:r>
           </w:p>
         </w:tc>
@@ -3393,7 +3393,7 @@
                 <w:sz w:val="20"/>
                 <w:szCs w:val="20"/>
               </w:rPr>
-              <w:t xml:space="preserve">85–90</w:t>
+              <w:t xml:space="preserve">85â€“90</w:t>
             </w:r>
           </w:p>
         </w:tc>
@@ -3630,7 +3630,7 @@
                 <w:sz w:val="20"/>
                 <w:szCs w:val="20"/>
               </w:rPr>
-              <w:t xml:space="preserve">console.anthropic.com → Usage. Check about every 15 minutes.</w:t>
+              <w:t xml:space="preserve">console.anthropic.com â†’ Usage. Check about every 15 minutes.</w:t>
             </w:r>
           </w:p>
         </w:tc>
@@ -3699,7 +3699,7 @@
                 <w:sz w:val="20"/>
                 <w:szCs w:val="20"/>
               </w:rPr>
-              <w:t xml:space="preserve">Vercel → lpu-assignment-app → Logs. Filter for errors.</w:t>
+              <w:t xml:space="preserve">Vercel â†’ lpu-assignment-app â†’ Logs. Filter for errors.</w:t>
             </w:r>
           </w:p>
         </w:tc>
@@ -3766,7 +3766,7 @@
                 <w:sz w:val="20"/>
                 <w:szCs w:val="20"/>
               </w:rPr>
-              <w:t xml:space="preserve">Supabase → Authentication → Users. Newest at the top. Only look, do not change anything.</w:t>
+              <w:t xml:space="preserve">Supabase â†’ Authentication â†’ Users. Newest at the top. Only look, do not change anything.</w:t>
             </w:r>
           </w:p>
         </w:tc>
@@ -3783,7 +3783,7 @@
           <w:sz w:val="22"/>
           <w:szCs w:val="22"/>
         </w:rPr>
-        <w:t xml:space="preserve">If many people see “The AI model request failed” at once, ask everyone to pause for two minutes and then try again. If the message “The AI service is not configured” or repeated failures appear for everyone, check your credit balance first.</w:t>
+        <w:t xml:space="preserve">If many people see â€œThe AI model request failedâ€ at once, ask everyone to pause for two minutes and then try again. If the message â€œThe AI service is not configuredâ€ or repeated failures appear for everyone, check your credit balance first.</w:t>
       </w:r>
     </w:p>
     <w:p>
@@ -3815,7 +3815,7 @@
           <w:sz w:val="22"/>
           <w:szCs w:val="22"/>
         </w:rPr>
-        <w:t xml:space="preserve">As the project owner you can see every participant’s rows in Supabase. The app itself never shows one person’s work to another. There are two ways in. Both are safe if you only </w:t>
+        <w:t xml:space="preserve">As the project owner you can see every participantâ€™s rows in Supabase. The app itself never shows one personâ€™s work to another. There are two ways in. Both are safe if you only </w:t>
       </w:r>
       <w:r>
         <w:rPr>
@@ -4397,7 +4397,7 @@
           <w:sz w:val="23"/>
           <w:szCs w:val="23"/>
         </w:rPr>
-        <w:t xml:space="preserve">Q1 · Participation at a glance</w:t>
+        <w:t xml:space="preserve">Q1 Â· Participation at a glance</w:t>
       </w:r>
     </w:p>
     <w:p>
@@ -4601,7 +4601,7 @@
           <w:sz w:val="23"/>
           <w:szCs w:val="23"/>
         </w:rPr>
-        <w:t xml:space="preserve">Q2 · Activity per participant (anonymised)</w:t>
+        <w:t xml:space="preserve">Q2 Â· Activity per participant (anonymised)</w:t>
       </w:r>
     </w:p>
     <w:p>
@@ -4833,7 +4833,7 @@
           <w:sz w:val="23"/>
           <w:szCs w:val="23"/>
         </w:rPr>
-        <w:t xml:space="preserve">Q3 · Assignments by discipline</w:t>
+        <w:t xml:space="preserve">Q3 Â· Assignments by discipline</w:t>
       </w:r>
     </w:p>
     <w:p>
@@ -4995,7 +4995,7 @@
           <w:sz w:val="23"/>
           <w:szCs w:val="23"/>
         </w:rPr>
-        <w:t xml:space="preserve">Q4 · Lane and AI Role Level choices</w:t>
+        <w:t xml:space="preserve">Q4 Â· Lane and AI Role Level choices</w:t>
       </w:r>
     </w:p>
     <w:p>
@@ -5157,7 +5157,7 @@
           <w:sz w:val="23"/>
           <w:szCs w:val="23"/>
         </w:rPr>
-        <w:t xml:space="preserve">Q5 · Depth of mastery (Miller tier) and oral verification</w:t>
+        <w:t xml:space="preserve">Q5 Â· Depth of mastery (Miller tier) and oral verification</w:t>
       </w:r>
     </w:p>
     <w:p>
@@ -5361,7 +5361,7 @@
           <w:sz w:val="23"/>
           <w:szCs w:val="23"/>
         </w:rPr>
-        <w:t xml:space="preserve">Q6 · Guideline compliance health check</w:t>
+        <w:t xml:space="preserve">Q6 Â· Guideline compliance health check</w:t>
       </w:r>
     </w:p>
     <w:p>
@@ -5733,7 +5733,7 @@
           <w:sz w:val="23"/>
           <w:szCs w:val="23"/>
         </w:rPr>
-        <w:t xml:space="preserve">Q7 · Stress-test results overall</w:t>
+        <w:t xml:space="preserve">Q7 Â· Stress-test results overall</w:t>
       </w:r>
     </w:p>
     <w:p>
@@ -5951,7 +5951,7 @@
           <w:sz w:val="23"/>
           <w:szCs w:val="23"/>
         </w:rPr>
-        <w:t xml:space="preserve">Q8 · Which kinds of criteria can an AI satisfy most easily?</w:t>
+        <w:t xml:space="preserve">Q8 Â· Which kinds of criteria can an AI satisfy most easily?</w:t>
       </w:r>
     </w:p>
     <w:p>
@@ -6337,7 +6337,7 @@
           <w:sz w:val="23"/>
           <w:szCs w:val="23"/>
         </w:rPr>
-        <w:t xml:space="preserve">Q9 · Stress-test score by AI Role Level</w:t>
+        <w:t xml:space="preserve">Q9 Â· Stress-test score by AI Role Level</w:t>
       </w:r>
     </w:p>
     <w:p>
@@ -6555,7 +6555,7 @@
           <w:sz w:val="23"/>
           <w:szCs w:val="23"/>
         </w:rPr>
-        <w:t xml:space="preserve">Q10 · Activity by day (India time)</w:t>
+        <w:t xml:space="preserve">Q10 Â· Activity by day (India time)</w:t>
       </w:r>
     </w:p>
     <w:p>
@@ -6773,7 +6773,7 @@
           <w:sz w:val="23"/>
           <w:szCs w:val="23"/>
         </w:rPr>
-        <w:t xml:space="preserve">Q11 · Read a sample of the actual tasks (quality review)</w:t>
+        <w:t xml:space="preserve">Q11 Â· Read a sample of the actual tasks (quality review)</w:t>
       </w:r>
     </w:p>
     <w:p>
@@ -7033,7 +7033,7 @@
           <w:sz w:val="23"/>
           <w:szCs w:val="23"/>
         </w:rPr>
-        <w:t xml:space="preserve">Q12 · Heaviest users (check the daily caps)</w:t>
+        <w:t xml:space="preserve">Q12 Â· Heaviest users (check the daily caps)</w:t>
       </w:r>
     </w:p>
     <w:p>
@@ -7389,7 +7389,7 @@
           <w:sz w:val="22"/>
           <w:szCs w:val="22"/>
         </w:rPr>
-        <w:t xml:space="preserve"> (Q11 and the “Reading a sample by hand” exercise below). Numbers say what happened; reading says whether it is any good.</w:t>
+        <w:t xml:space="preserve"> (Q11 and the â€œReading a sample by handâ€ exercise below). Numbers say what happened; reading says whether it is any good.</w:t>
       </w:r>
     </w:p>
     <w:p>
@@ -7449,7 +7449,7 @@
           <w:sz w:val="22"/>
           <w:szCs w:val="22"/>
         </w:rPr>
-        <w:t xml:space="preserve"> open the CSV, select the table, choose Insert → Chart (or PivotTable), and pick a bar chart. Bar charts work best for Q3, Q4, Q7 and Q8.</w:t>
+        <w:t xml:space="preserve"> open the CSV, select the table, choose Insert â†’ Chart (or PivotTable), and pick a bar chart. Bar charts work best for Q3, Q4, Q7 and Q8.</w:t>
       </w:r>
     </w:p>
     <w:p>
@@ -7523,7 +7523,7 @@
                 <w:sz w:val="20"/>
                 <w:szCs w:val="20"/>
               </w:rPr>
-              <w:t xml:space="preserve">If you see…</w:t>
+              <w:t xml:space="preserve">If you seeâ€¦</w:t>
             </w:r>
           </w:p>
         </w:tc>
@@ -7557,7 +7557,7 @@
                 <w:sz w:val="20"/>
                 <w:szCs w:val="20"/>
               </w:rPr>
-              <w:t xml:space="preserve">It probably means…</w:t>
+              <w:t xml:space="preserve">It probably meansâ€¦</w:t>
             </w:r>
           </w:p>
         </w:tc>
@@ -7758,7 +7758,7 @@
                 <w:sz w:val="20"/>
                 <w:szCs w:val="20"/>
               </w:rPr>
-              <w:t xml:space="preserve">Their descriptors are written as qualities (“well argued”) instead of student decisions (“rejects one AI suggestion and says why”).</w:t>
+              <w:t xml:space="preserve">Their descriptors are written as qualities (â€œwell arguedâ€) instead of student decisions (â€œrejects one AI suggestion and says whyâ€).</w:t>
             </w:r>
           </w:p>
         </w:tc>
@@ -8124,7 +8124,7 @@
                 <w:sz w:val="20"/>
                 <w:szCs w:val="20"/>
               </w:rPr>
-              <w:t xml:space="preserve">Q5: mostly “Knows” or “Knows how”</w:t>
+              <w:t xml:space="preserve">Q5: mostly â€œKnowsâ€ or â€œKnows howâ€</w:t>
             </w:r>
           </w:p>
         </w:tc>
@@ -8188,7 +8188,7 @@
                 <w:sz w:val="20"/>
                 <w:szCs w:val="20"/>
               </w:rPr>
-              <w:t xml:space="preserve">Encourage at least one task per course at “Shows how” or “Does”.</w:t>
+              <w:t xml:space="preserve">Encourage at least one task per course at â€œShows howâ€ or â€œDoesâ€.</w:t>
             </w:r>
           </w:p>
         </w:tc>
@@ -8224,7 +8224,7 @@
                 <w:sz w:val="20"/>
                 <w:szCs w:val="20"/>
               </w:rPr>
-              <w:t xml:space="preserve">Q5: oral verification mostly “None”</w:t>
+              <w:t xml:space="preserve">Q5: oral verification mostly â€œNoneâ€</w:t>
             </w:r>
           </w:p>
         </w:tc>
@@ -9718,7 +9718,7 @@
           <w:sz w:val="22"/>
           <w:szCs w:val="22"/>
         </w:rPr>
-        <w:t xml:space="preserve">Run the three queries below </w:t>
+        <w:t xml:space="preserve">Participants can delete their own saved assignments, and download their data, on the </w:t>
       </w:r>
       <w:r>
         <w:rPr>
@@ -9729,16 +9729,16 @@
           <w:sz w:val="22"/>
           <w:szCs w:val="22"/>
         </w:rPr>
-        <w:t xml:space="preserve">in order</w:t>
-      </w:r>
-      <w:r>
-        <w:rPr>
-          <w:rFonts w:ascii="Calibri" w:cs="Calibri" w:eastAsia="Calibri" w:hAnsi="Calibri"/>
-          <w:color w:val="211E1A"/>
-          <w:sz w:val="22"/>
-          <w:szCs w:val="22"/>
-        </w:rPr>
-        <w:t xml:space="preserve">, one at a time, after replacing person@example.com with that person’s email address (keep the quote marks). Run the first one, check the numbers are what you expect, then the other two. </w:t>
+        <w:t xml:space="preserve">Account</w:t>
+      </w:r>
+      <w:r>
+        <w:rPr>
+          <w:rFonts w:ascii="Calibri" w:cs="Calibri" w:eastAsia="Calibri" w:hAnsi="Calibri"/>
+          <w:color w:val="211E1A"/>
+          <w:sz w:val="22"/>
+          <w:szCs w:val="22"/>
+        </w:rPr>
+        <w:t xml:space="preserve"> page of the app. The queries below are for when someone asks </w:t>
       </w:r>
       <w:r>
         <w:rPr>
@@ -9749,20 +9749,74 @@
           <w:sz w:val="22"/>
           <w:szCs w:val="22"/>
         </w:rPr>
-        <w:t xml:space="preserve">Deleting cannot be undone.</w:t>
-      </w:r>
-      <w:r>
-        <w:rPr>
-          <w:rFonts w:ascii="Calibri" w:cs="Calibri" w:eastAsia="Calibri" w:hAnsi="Calibri"/>
-          <w:color w:val="211E1A"/>
-          <w:sz w:val="22"/>
-          <w:szCs w:val="22"/>
-        </w:rPr>
-        <w:t xml:space="preserve"> Only these queries touch data; they affect only that one person, and only this app’s tables.</w:t>
+        <w:t xml:space="preserve">you</w:t>
+      </w:r>
+      <w:r>
+        <w:rPr>
+          <w:rFonts w:ascii="Calibri" w:cs="Calibri" w:eastAsia="Calibri" w:hAnsi="Calibri"/>
+          <w:color w:val="211E1A"/>
+          <w:sz w:val="22"/>
+          <w:szCs w:val="22"/>
+        </w:rPr>
+        <w:t xml:space="preserve"> to delete their data, or when you also need to remove their usage records. Their login itself is not removed by these queries.</w:t>
       </w:r>
     </w:p>
     <w:p>
       <w:pPr>
+        <w:spacing w:after="120" w:before="0" w:line="276"/>
+      </w:pPr>
+      <w:r>
+        <w:rPr>
+          <w:rFonts w:ascii="Calibri" w:cs="Calibri" w:eastAsia="Calibri" w:hAnsi="Calibri"/>
+          <w:color w:val="211E1A"/>
+          <w:sz w:val="22"/>
+          <w:szCs w:val="22"/>
+        </w:rPr>
+        <w:t xml:space="preserve">Run the three queries below </w:t>
+      </w:r>
+      <w:r>
+        <w:rPr>
+          <w:rFonts w:ascii="Calibri" w:cs="Calibri" w:eastAsia="Calibri" w:hAnsi="Calibri"/>
+          <w:b/>
+          <w:bCs/>
+          <w:color w:val="211E1A"/>
+          <w:sz w:val="22"/>
+          <w:szCs w:val="22"/>
+        </w:rPr>
+        <w:t xml:space="preserve">in order</w:t>
+      </w:r>
+      <w:r>
+        <w:rPr>
+          <w:rFonts w:ascii="Calibri" w:cs="Calibri" w:eastAsia="Calibri" w:hAnsi="Calibri"/>
+          <w:color w:val="211E1A"/>
+          <w:sz w:val="22"/>
+          <w:szCs w:val="22"/>
+        </w:rPr>
+        <w:t xml:space="preserve">, one at a time, after replacing person@example.com with that personâ€™s email address (keep the quote marks). Run the first one, check the numbers are what you expect, then the other two. </w:t>
+      </w:r>
+      <w:r>
+        <w:rPr>
+          <w:rFonts w:ascii="Calibri" w:cs="Calibri" w:eastAsia="Calibri" w:hAnsi="Calibri"/>
+          <w:b/>
+          <w:bCs/>
+          <w:color w:val="211E1A"/>
+          <w:sz w:val="22"/>
+          <w:szCs w:val="22"/>
+        </w:rPr>
+        <w:t xml:space="preserve">Deleting cannot be undone.</w:t>
+      </w:r>
+      <w:r>
+        <w:rPr>
+          <w:rFonts w:ascii="Calibri" w:cs="Calibri" w:eastAsia="Calibri" w:hAnsi="Calibri"/>
+          <w:color w:val="211E1A"/>
+          <w:sz w:val="22"/>
+          <w:szCs w:val="22"/>
+        </w:rPr>
+        <w:t xml:space="preserve"> Only these queries touch data; they affect only that one person, and only this appâ€™s tables.</w:t>
+      </w:r>
+    </w:p>
+    <w:p>
+      <w:pPr>
         <w:keepNext/>
         <w:spacing w:after="60" w:before="100" w:line="276"/>
       </w:pPr>
@@ -9775,7 +9829,7 @@
           <w:sz w:val="22"/>
           <w:szCs w:val="22"/>
         </w:rPr>
-        <w:t xml:space="preserve">M1 · Preview: how much data does one person have?</w:t>
+        <w:t xml:space="preserve">M1 Â· Preview: how much data does one person have?</w:t>
       </w:r>
     </w:p>
     <w:tbl>
@@ -9899,7 +9953,7 @@
           <w:sz w:val="22"/>
           <w:szCs w:val="22"/>
         </w:rPr>
-        <w:t xml:space="preserve">M2 · Delete one person's assignments</w:t>
+        <w:t xml:space="preserve">M2 Â· Delete one person's assignments</w:t>
       </w:r>
     </w:p>
     <w:tbl>
@@ -9981,7 +10035,7 @@
           <w:sz w:val="22"/>
           <w:szCs w:val="22"/>
         </w:rPr>
-        <w:t xml:space="preserve">M3 · Delete one person's usage log</w:t>
+        <w:t xml:space="preserve">M3 Â· Delete one person's usage log</w:t>
       </w:r>
     </w:p>
     <w:tbl>
@@ -10118,7 +10172,7 @@
                 <w:sz w:val="21"/>
                 <w:szCs w:val="21"/>
               </w:rPr>
-              <w:t xml:space="preserve">Do not delete the person from Authentication → Users. Their login is shared with your other app. Deleting their lpu_ rows removes everything this app holds about their work.</w:t>
+              <w:t xml:space="preserve">Do not delete the person from Authentication â†’ Users. Their login is shared with your other app. Deleting their lpu_ rows removes everything this app holds about their work.</w:t>
             </w:r>
           </w:p>
         </w:tc>
@@ -10216,7 +10270,7 @@
           <w:sz w:val="22"/>
           <w:szCs w:val="22"/>
         </w:rPr>
-        <w:t xml:space="preserve">To stop all AI spending: go to console.anthropic.com → Settings → API Keys and delete the key, or simply stop adding credit. The app keeps working for logging in and viewing History, but cannot generate.</w:t>
+        <w:t xml:space="preserve">To stop all AI spending: go to console.anthropic.com â†’ Settings â†’ API Keys and delete the key, or simply stop adding credit. The app keeps working for logging in and viewing History, but cannot generate.</w:t>
       </w:r>
     </w:p>
     <w:p>
@@ -10582,7 +10636,7 @@
                 <w:sz w:val="20"/>
                 <w:szCs w:val="20"/>
               </w:rPr>
-              <w:t xml:space="preserve">Everyone gets “The AI service is not configured”</w:t>
+              <w:t xml:space="preserve">Everyone gets â€œThe AI service is not configuredâ€</w:t>
             </w:r>
           </w:p>
         </w:tc>
@@ -10614,7 +10668,7 @@
                 <w:sz w:val="20"/>
                 <w:szCs w:val="20"/>
               </w:rPr>
-              <w:t xml:space="preserve">The AI key is missing or was changed. In Vercel → Settings → Environment Variables check that ANTHROPIC_API_KEY exists, then redeploy.</w:t>
+              <w:t xml:space="preserve">The AI key is missing or was changed. In Vercel â†’ Settings â†’ Environment Variables check that ANTHROPIC_API_KEY exists, then redeploy.</w:t>
             </w:r>
           </w:p>
         </w:tc>
@@ -10650,7 +10704,7 @@
                 <w:sz w:val="20"/>
                 <w:szCs w:val="20"/>
               </w:rPr>
-              <w:t xml:space="preserve">Everyone gets “The AI model request failed”</w:t>
+              <w:t xml:space="preserve">Everyone gets â€œThe AI model request failedâ€</w:t>
             </w:r>
           </w:p>
         </w:tc>
@@ -10681,7 +10735,7 @@
                 <w:sz w:val="20"/>
                 <w:szCs w:val="20"/>
               </w:rPr>
-              <w:t xml:space="preserve">Most often the Anthropic credit has run out or the key was deleted. Check console.anthropic.com → Billing and API Keys. If both are fine, wait a few minutes and try again.</w:t>
+              <w:t xml:space="preserve">Most often the Anthropic credit has run out or the key was deleted. Check console.anthropic.com â†’ Billing and API Keys. If both are fine, wait a few minutes and try again.</w:t>
             </w:r>
           </w:p>
         </w:tc>
@@ -10718,7 +10772,7 @@
                 <w:sz w:val="20"/>
                 <w:szCs w:val="20"/>
               </w:rPr>
-              <w:t xml:space="preserve">Someone says “Daily limit reached”</w:t>
+              <w:t xml:space="preserve">Someone says â€œDaily limit reachedâ€</w:t>
             </w:r>
           </w:p>
         </w:tc>
@@ -10886,7 +10940,7 @@
                 <w:sz w:val="20"/>
                 <w:szCs w:val="20"/>
               </w:rPr>
-              <w:t xml:space="preserve">Open Vercel → Deployments. The top row should say Ready. If it says Error, open it to read why and tell the person who looks after the app.</w:t>
+              <w:t xml:space="preserve">Open Vercel â†’ Deployments. The top row should say Ready. If it says Error, open it to read why and tell the person who looks after the app.</w:t>
             </w:r>
           </w:p>
         </w:tc>
@@ -11045,7 +11099,7 @@
           <w:sz w:val="22"/>
           <w:szCs w:val="22"/>
         </w:rPr>
-        <w:t xml:space="preserve">Sign-up emails come from Supabase’s built-in sender, which has a low hourly limit.</w:t>
+        <w:t xml:space="preserve">Sign-up emails come from Supabaseâ€™s built-in sender, which has a low hourly limit.</w:t>
       </w:r>
     </w:p>
     <w:p>
@@ -11083,7 +11137,7 @@
           <w:sz w:val="22"/>
           <w:szCs w:val="22"/>
         </w:rPr>
-        <w:t xml:space="preserve">The AI Stress Test marks its own attempt using an AI. Treat the scores as a strong signal, not a verdict. Always read the AI’s attempt and the explanations.</w:t>
+        <w:t xml:space="preserve">The AI Stress Test marks its own attempt using an AI. Treat the scores as a strong signal, not a verdict. Always read the AIâ€™s attempt and the explanations.</w:t>
       </w:r>
     </w:p>
     <w:sectPr>
@@ -11147,7 +11201,7 @@
         <w:sz w:val="17"/>
         <w:szCs w:val="17"/>
       </w:rPr>
-      <w:t xml:space="preserve">LPU Assignment &amp; Rubric Designer – Facilitator Guide   ·   Page </w:t>
+      <w:t xml:space="preserve">LPU Assignment &amp; Rubric Designer â€“ Facilitator Guide   ·   Page </w:t>
       <w:fldChar w:fldCharType="begin"/>
       <w:instrText xml:space="preserve">PAGE</w:instrText>
       <w:fldChar w:fldCharType="separate"/>

</xml_diff>